<commit_message>
Correct DIGEMABEL project dates
</commit_message>
<xml_diff>
--- a/public/CV_Cristhian_Rolon.docx
+++ b/public/CV_Cristhian_Rolon.docx
@@ -268,7 +268,7 @@
         <w:spacing w:after="60"/>
       </w:pPr>
       <w:r>
-        <w:t xml:space="preserve">Participar de manera integral en el relevamiento, análisis, diseño, programación, integración, soporte y capacitación de sistemas web full stack, actuando como responsable técnico en el proyecto DIGEMABEL (trazabilidad end-to-end y SCM).</w:t>
+        <w:t>Participar de manera integral en el relevamiento, análisis, diseño, programación, integración, soporte y capacitación de sistemas web full stack, actuando como responsable técnico en el proyecto DIGEMABEL (trazabilidad end-to-end y SCM) hasta 2025.</w:t>
       </w:r>
     </w:p>
     <w:p>
@@ -281,7 +281,7 @@
         <w:spacing w:after="60"/>
       </w:pPr>
       <w:r>
-        <w:t xml:space="preserve">Acompañar la evolución del negocio durante la transición institucional de DIMABEL a DIGEMABEL, garantizando la continuidad operativa del sistema.</w:t>
+        <w:t>Acompañar la evolución del negocio durante la transición institucional de DIMABEL a DIGEMABEL, garantizando la continuidad operativa del sistema hasta 2025.</w:t>
       </w:r>
     </w:p>
     <w:p>
@@ -574,11 +574,9 @@
           <w:b/>
           <w:bCs/>
         </w:rPr>
-        <w:t xml:space="preserve">DIGEMABEL: </w:t>
-      </w:r>
-      <w:r>
-        <w:t xml:space="preserve">Responsable técnico en el relevamiento, análisis, diseño, programación, integración, despliegue, mantenimiento, soporte y capacitación de un sistema web full stack para trazabilidad end-to-end y SCM con Java, Spring Boot, APIs REST, Nginx y Oracle 19c, acompañando la transición institucional de DIMABEL a DIGEMABEL.</w:t>
-      </w:r>
+        <w:t>DIGEMABEL (2022 - 2025): Responsable técnico en el relevamiento, análisis, diseño, programación, integración, despliegue, mantenimiento, soporte y capacitación de un sistema web full stack para trazabilidad end-to-end y SCM con Java, Spring Boot, APIs REST, Nginx y Oracle 19c, acompañando la transición institucional de DIMABEL a DIGEMABEL.</w:t>
+      </w:r>
+      <w:r/>
     </w:p>
     <w:p>
       <w:pPr>

</xml_diff>

<commit_message>
Unify professional experience timeline
</commit_message>
<xml_diff>
--- a/public/CV_Cristhian_Rolon.docx
+++ b/public/CV_Cristhian_Rolon.docx
@@ -268,7 +268,8 @@
         <w:spacing w:after="60"/>
       </w:pPr>
       <w:r>
-        <w:t>Participar de manera integral en el relevamiento, análisis, diseño, programación, integración, soporte y capacitación de sistemas web full stack, actuando como responsable técnico en el proyecto DIGEMABEL (trazabilidad end-to-end y SCM) hasta 2025.</w:t>
+        <w:rPr/>
+        <w:t>Actuar como responsable técnico en proyectos web full stack, cubriendo relevamiento, análisis, diseño, programación, integración, despliegue, mantenimiento, soporte y capacitación, con trato directo con usuarios, equipos técnicos y directivos.</w:t>
       </w:r>
     </w:p>
     <w:p>
@@ -281,7 +282,8 @@
         <w:spacing w:after="60"/>
       </w:pPr>
       <w:r>
-        <w:t>Acompañar la evolución del negocio durante la transición institucional de DIMABEL a DIGEMABEL, garantizando la continuidad operativa del sistema hasta 2025.</w:t>
+        <w:rPr/>
+        <w:t>Durante esta etapa, acompañar la continuidad operativa del sistema SID hasta 2025 y el impacto institucional de la transición de DIMABEL a DIGEMABEL, incluyendo el reconocimiento oficial recibido en 2024.</w:t>
       </w:r>
     </w:p>
     <w:p>
@@ -574,9 +576,16 @@
           <w:b/>
           <w:bCs/>
         </w:rPr>
-        <w:t>DIGEMABEL (2022 - 2025): Responsable técnico en el relevamiento, análisis, diseño, programación, integración, despliegue, mantenimiento, soporte y capacitación de un sistema web full stack para trazabilidad end-to-end y SCM con Java, Spring Boot, APIs REST, Nginx y Oracle 19c, acompañando la transición institucional de DIMABEL a DIGEMABEL.</w:t>
+        <w:t xml:space="preserve">DIGEMABEL (2022 - 2025): </w:t>
       </w:r>
       <w:r/>
+      <w:r>
+        <w:rPr/>
+      </w:r>
+      <w:r>
+        <w:rPr/>
+        <w:t>Responsable técnico en el relevamiento, análisis, diseño, programación, integración, despliegue, mantenimiento, soporte y capacitación de un sistema web full stack para trazabilidad end-to-end y SCM con Java, Spring Boot, APIs REST, Nginx y Oracle 19c, acompañando la transición institucional de DIMABEL a DIGEMABEL.</w:t>
+      </w:r>
     </w:p>
     <w:p>
       <w:pPr>

</xml_diff>